<commit_message>
feat: full project sync — automation modules, dashboard, skills, tools
- Updated all LinkedinAutomation modules (security hardening, Ollama, PDF gen, etc.)
- Added apply_security.py, tmp_cleanup.py, vps_computer/ cluster support
- Added phone_connect/, web_scraper/, tech-tutor/ tools
- Added skills/ (35 Trail of Bits + GSD workflow)
- Added .planning/ codebase docs, CLAUDE.md, .claude/ commands
- Removed PII files from tracking (profile.json, intake_form.json)
- Updated run_daily.py, run_scheduler.py, test_end_to_end.py

Co-Authored-By: Claude Opus 4.6 <noreply@anthropic.com>
</commit_message>
<xml_diff>
--- a/candidate/gold_standard_resume.docx
+++ b/candidate/gold_standard_resume.docx
@@ -150,7 +150,7 @@
         <w:t>Power Platform Consultant</w:t>
       </w:r>
       <w:r>
-        <w:t xml:space="preserve">                                                    Sep 2025 – Jan 2026</w:t>
+        <w:t xml:space="preserve">                                                    Sep 2025 - Jan 2026</w:t>
       </w:r>
     </w:p>
     <w:p>
@@ -304,7 +304,7 @@
         <w:t>Senior Power Platform Developer</w:t>
       </w:r>
       <w:r>
-        <w:t xml:space="preserve">                                             Jan 2023 – July 2025</w:t>
+        <w:t xml:space="preserve">                                             Jan 2023 - July 2025</w:t>
       </w:r>
     </w:p>
     <w:p>
@@ -455,7 +455,7 @@
         <w:t>Power Platform Developer</w:t>
       </w:r>
       <w:r>
-        <w:t xml:space="preserve">                                                     Jan 2019 – Dec 2022</w:t>
+        <w:t xml:space="preserve">                                                     Jan 2019 - Dec 2022</w:t>
       </w:r>
     </w:p>
     <w:p>
@@ -614,7 +614,7 @@
         <w:t>SharePoint &amp; Power Apps Developer</w:t>
       </w:r>
       <w:r>
-        <w:t xml:space="preserve">                                            Sep 2016 – Dec 2018</w:t>
+        <w:t xml:space="preserve">                                            Sep 2016 - Dec 2018</w:t>
       </w:r>
     </w:p>
     <w:p>

</xml_diff>